<commit_message>
Tarefa 5: acrescenta Missao 4 - o Nicolas desenha o Modo Amigos (social)
Co-Authored-By: Claude Fable 5 <noreply@anthropic.com>
</commit_message>
<xml_diff>
--- a/01_PRODUCT/Tarefa_5_Nicolas_Nome_Videos_Defesa.docx
+++ b/01_PRODUCT/Tarefa_5_Nicolas_Nome_Videos_Defesa.docx
@@ -1720,6 +1720,515 @@
           <w:sz w:val="26"/>
           <w:szCs w:val="26"/>
         </w:rPr>
+        <w:t xml:space="preserve">MISSÃO 4  </w:t>
+      </w:r>
+      <w:r>
+        <w:rPr>
+          <w:rFonts w:ascii="Arial" w:cs="Arial" w:eastAsia="Arial" w:hAnsi="Arial"/>
+          <w:b/>
+          <w:bCs/>
+          <w:color w:val="0C4A2F"/>
+          <w:sz w:val="26"/>
+          <w:szCs w:val="26"/>
+        </w:rPr>
+        <w:t xml:space="preserve">Desenha o Modo Amigos 👥</w:t>
+      </w:r>
+    </w:p>
+    <w:p>
+      <w:pPr>
+        <w:spacing w:after="120"/>
+      </w:pPr>
+      <w:r>
+        <w:rPr>
+          <w:rFonts w:ascii="Arial" w:cs="Arial" w:eastAsia="Arial" w:hAnsi="Arial"/>
+          <w:color w:val="1A2E24"/>
+          <w:sz w:val="21"/>
+          <w:szCs w:val="21"/>
+        </w:rPr>
+        <w:t xml:space="preserve">Está na hora de pensar na parte social: </w:t>
+      </w:r>
+      <w:r>
+        <w:rPr>
+          <w:rFonts w:ascii="Arial" w:cs="Arial" w:eastAsia="Arial" w:hAnsi="Arial"/>
+          <w:b/>
+          <w:bCs/>
+          <w:color w:val="1A2E24"/>
+          <w:sz w:val="21"/>
+          <w:szCs w:val="21"/>
+        </w:rPr>
+        <w:t xml:space="preserve">partilhar sucessos e exercícios com os teus amigos</w:t>
+      </w:r>
+      <w:r>
+        <w:rPr>
+          <w:rFonts w:ascii="Arial" w:cs="Arial" w:eastAsia="Arial" w:hAnsi="Arial"/>
+          <w:color w:val="1A2E24"/>
+          <w:sz w:val="21"/>
+          <w:szCs w:val="21"/>
+        </w:rPr>
+        <w:t xml:space="preserve">. Tu é que sabes como os teus amigos funcionam — desenha tu:</w:t>
+      </w:r>
+    </w:p>
+    <w:p>
+      <w:pPr>
+        <w:spacing w:after="100" w:before="160"/>
+      </w:pPr>
+      <w:r>
+        <w:rPr>
+          <w:rFonts w:ascii="Arial" w:cs="Arial" w:eastAsia="Arial" w:hAnsi="Arial"/>
+          <w:b/>
+          <w:bCs/>
+          <w:color w:val="16A34A"/>
+          <w:sz w:val="22"/>
+          <w:szCs w:val="22"/>
+        </w:rPr>
+        <w:t xml:space="preserve">O QUE GOSTAVAS DE PARTILHAR? (podes marcar vários)</w:t>
+      </w:r>
+    </w:p>
+    <w:p>
+      <w:pPr>
+        <w:spacing w:after="100"/>
+        <w:ind w:left="240"/>
+      </w:pPr>
+      <w:r>
+        <w:rPr>
+          <w:rFonts w:ascii="Arial" w:cs="Arial" w:eastAsia="Arial" w:hAnsi="Arial"/>
+          <w:color w:val="16A34A"/>
+          <w:sz w:val="26"/>
+          <w:szCs w:val="26"/>
+        </w:rPr>
+        <w:t xml:space="preserve">☐  </w:t>
+      </w:r>
+      <w:r>
+        <w:rPr>
+          <w:rFonts w:ascii="Arial" w:cs="Arial" w:eastAsia="Arial" w:hAnsi="Arial"/>
+          <w:color w:val="1A2E24"/>
+          <w:sz w:val="21"/>
+          <w:szCs w:val="21"/>
+        </w:rPr>
+        <w:t xml:space="preserve">O meu cartão de jogador (rating + atributos)</w:t>
+      </w:r>
+    </w:p>
+    <w:p>
+      <w:pPr>
+        <w:spacing w:after="100"/>
+        <w:ind w:left="240"/>
+      </w:pPr>
+      <w:r>
+        <w:rPr>
+          <w:rFonts w:ascii="Arial" w:cs="Arial" w:eastAsia="Arial" w:hAnsi="Arial"/>
+          <w:color w:val="16A34A"/>
+          <w:sz w:val="26"/>
+          <w:szCs w:val="26"/>
+        </w:rPr>
+        <w:t xml:space="preserve">☐  </w:t>
+      </w:r>
+      <w:r>
+        <w:rPr>
+          <w:rFonts w:ascii="Arial" w:cs="Arial" w:eastAsia="Arial" w:hAnsi="Arial"/>
+          <w:color w:val="1A2E24"/>
+          <w:sz w:val="21"/>
+          <w:szCs w:val="21"/>
+        </w:rPr>
+        <w:t xml:space="preserve">A minha streak 🔥</w:t>
+      </w:r>
+    </w:p>
+    <w:p>
+      <w:pPr>
+        <w:spacing w:after="100"/>
+        <w:ind w:left="240"/>
+      </w:pPr>
+      <w:r>
+        <w:rPr>
+          <w:rFonts w:ascii="Arial" w:cs="Arial" w:eastAsia="Arial" w:hAnsi="Arial"/>
+          <w:color w:val="16A34A"/>
+          <w:sz w:val="26"/>
+          <w:szCs w:val="26"/>
+        </w:rPr>
+        <w:t xml:space="preserve">☐  </w:t>
+      </w:r>
+      <w:r>
+        <w:rPr>
+          <w:rFonts w:ascii="Arial" w:cs="Arial" w:eastAsia="Arial" w:hAnsi="Arial"/>
+          <w:color w:val="1A2E24"/>
+          <w:sz w:val="21"/>
+          <w:szCs w:val="21"/>
+        </w:rPr>
+        <w:t xml:space="preserve">Programa completo / medalhas 🏆</w:t>
+      </w:r>
+    </w:p>
+    <w:p>
+      <w:pPr>
+        <w:spacing w:after="100"/>
+        <w:ind w:left="240"/>
+      </w:pPr>
+      <w:r>
+        <w:rPr>
+          <w:rFonts w:ascii="Arial" w:cs="Arial" w:eastAsia="Arial" w:hAnsi="Arial"/>
+          <w:color w:val="16A34A"/>
+          <w:sz w:val="26"/>
+          <w:szCs w:val="26"/>
+        </w:rPr>
+        <w:t xml:space="preserve">☐  </w:t>
+      </w:r>
+      <w:r>
+        <w:rPr>
+          <w:rFonts w:ascii="Arial" w:cs="Arial" w:eastAsia="Arial" w:hAnsi="Arial"/>
+          <w:color w:val="1A2E24"/>
+          <w:sz w:val="21"/>
+          <w:szCs w:val="21"/>
+        </w:rPr>
+        <w:t xml:space="preserve">Um recorde ("fiz 45 toques de juggling!")</w:t>
+      </w:r>
+    </w:p>
+    <w:p>
+      <w:pPr>
+        <w:spacing w:after="100"/>
+        <w:ind w:left="240"/>
+      </w:pPr>
+      <w:r>
+        <w:rPr>
+          <w:rFonts w:ascii="Arial" w:cs="Arial" w:eastAsia="Arial" w:hAnsi="Arial"/>
+          <w:color w:val="16A34A"/>
+          <w:sz w:val="26"/>
+          <w:szCs w:val="26"/>
+        </w:rPr>
+        <w:t xml:space="preserve">☐  </w:t>
+      </w:r>
+      <w:r>
+        <w:rPr>
+          <w:rFonts w:ascii="Arial" w:cs="Arial" w:eastAsia="Arial" w:hAnsi="Arial"/>
+          <w:color w:val="1A2E24"/>
+          <w:sz w:val="21"/>
+          <w:szCs w:val="21"/>
+        </w:rPr>
+        <w:t xml:space="preserve">Um exercício-desafio ("tenta tu este!")</w:t>
+      </w:r>
+    </w:p>
+    <w:p>
+      <w:pPr>
+        <w:spacing w:after="100" w:before="160"/>
+      </w:pPr>
+      <w:r>
+        <w:rPr>
+          <w:rFonts w:ascii="Arial" w:cs="Arial" w:eastAsia="Arial" w:hAnsi="Arial"/>
+          <w:b/>
+          <w:bCs/>
+          <w:color w:val="16A34A"/>
+          <w:sz w:val="22"/>
+          <w:szCs w:val="22"/>
+        </w:rPr>
+        <w:t xml:space="preserve">COMO PREFERIAS PARTILHAR?</w:t>
+      </w:r>
+    </w:p>
+    <w:p>
+      <w:pPr>
+        <w:spacing w:after="100"/>
+        <w:ind w:left="240"/>
+      </w:pPr>
+      <w:r>
+        <w:rPr>
+          <w:rFonts w:ascii="Arial" w:cs="Arial" w:eastAsia="Arial" w:hAnsi="Arial"/>
+          <w:color w:val="16A34A"/>
+          <w:sz w:val="26"/>
+          <w:szCs w:val="26"/>
+        </w:rPr>
+        <w:t xml:space="preserve">☐  </w:t>
+      </w:r>
+      <w:r>
+        <w:rPr>
+          <w:rFonts w:ascii="Arial" w:cs="Arial" w:eastAsia="Arial" w:hAnsi="Arial"/>
+          <w:color w:val="1A2E24"/>
+          <w:sz w:val="21"/>
+          <w:szCs w:val="21"/>
+        </w:rPr>
+        <w:t xml:space="preserve">Imagem bonita para mandar no WhatsApp (funciona já, sem contas)</w:t>
+      </w:r>
+    </w:p>
+    <w:p>
+      <w:pPr>
+        <w:spacing w:after="100"/>
+        <w:ind w:left="240"/>
+      </w:pPr>
+      <w:r>
+        <w:rPr>
+          <w:rFonts w:ascii="Arial" w:cs="Arial" w:eastAsia="Arial" w:hAnsi="Arial"/>
+          <w:color w:val="16A34A"/>
+          <w:sz w:val="26"/>
+          <w:szCs w:val="26"/>
+        </w:rPr>
+        <w:t xml:space="preserve">☐  </w:t>
+      </w:r>
+      <w:r>
+        <w:rPr>
+          <w:rFonts w:ascii="Arial" w:cs="Arial" w:eastAsia="Arial" w:hAnsi="Arial"/>
+          <w:color w:val="1A2E24"/>
+          <w:sz w:val="21"/>
+          <w:szCs w:val="21"/>
+        </w:rPr>
+        <w:t xml:space="preserve">Os amigos verem dentro da app (precisa de contas — mais à frente)</w:t>
+      </w:r>
+    </w:p>
+    <w:p>
+      <w:pPr>
+        <w:spacing w:after="100"/>
+        <w:ind w:left="240"/>
+      </w:pPr>
+      <w:r>
+        <w:rPr>
+          <w:rFonts w:ascii="Arial" w:cs="Arial" w:eastAsia="Arial" w:hAnsi="Arial"/>
+          <w:color w:val="16A34A"/>
+          <w:sz w:val="26"/>
+          <w:szCs w:val="26"/>
+        </w:rPr>
+        <w:t xml:space="preserve">☐  </w:t>
+      </w:r>
+      <w:r>
+        <w:rPr>
+          <w:rFonts w:ascii="Arial" w:cs="Arial" w:eastAsia="Arial" w:hAnsi="Arial"/>
+          <w:color w:val="1A2E24"/>
+          <w:sz w:val="21"/>
+          <w:szCs w:val="21"/>
+        </w:rPr>
+        <w:t xml:space="preserve">As duas coisas: imagem já, contas depois</w:t>
+      </w:r>
+    </w:p>
+    <w:p>
+      <w:pPr>
+        <w:spacing w:after="100" w:before="160"/>
+      </w:pPr>
+      <w:r>
+        <w:rPr>
+          <w:rFonts w:ascii="Arial" w:cs="Arial" w:eastAsia="Arial" w:hAnsi="Arial"/>
+          <w:b/>
+          <w:bCs/>
+          <w:color w:val="16A34A"/>
+          <w:sz w:val="22"/>
+          <w:szCs w:val="22"/>
+        </w:rPr>
+        <w:t xml:space="preserve">QUE DESAFIO ENTRE AMIGOS SERIA MAIS FIXE? (escolhe o n.º 1)</w:t>
+      </w:r>
+    </w:p>
+    <w:p>
+      <w:pPr>
+        <w:spacing w:after="100"/>
+        <w:ind w:left="240"/>
+      </w:pPr>
+      <w:r>
+        <w:rPr>
+          <w:rFonts w:ascii="Arial" w:cs="Arial" w:eastAsia="Arial" w:hAnsi="Arial"/>
+          <w:color w:val="16A34A"/>
+          <w:sz w:val="26"/>
+          <w:szCs w:val="26"/>
+        </w:rPr>
+        <w:t xml:space="preserve">☐  </w:t>
+      </w:r>
+      <w:r>
+        <w:rPr>
+          <w:rFonts w:ascii="Arial" w:cs="Arial" w:eastAsia="Arial" w:hAnsi="Arial"/>
+          <w:color w:val="1A2E24"/>
+          <w:sz w:val="21"/>
+          <w:szCs w:val="21"/>
+        </w:rPr>
+        <w:t xml:space="preserve">Quem faz mais toques de juggling</w:t>
+      </w:r>
+    </w:p>
+    <w:p>
+      <w:pPr>
+        <w:spacing w:after="100"/>
+        <w:ind w:left="240"/>
+      </w:pPr>
+      <w:r>
+        <w:rPr>
+          <w:rFonts w:ascii="Arial" w:cs="Arial" w:eastAsia="Arial" w:hAnsi="Arial"/>
+          <w:color w:val="16A34A"/>
+          <w:sz w:val="26"/>
+          <w:szCs w:val="26"/>
+        </w:rPr>
+        <w:t xml:space="preserve">☐  </w:t>
+      </w:r>
+      <w:r>
+        <w:rPr>
+          <w:rFonts w:ascii="Arial" w:cs="Arial" w:eastAsia="Arial" w:hAnsi="Arial"/>
+          <w:color w:val="1A2E24"/>
+          <w:sz w:val="21"/>
+          <w:szCs w:val="21"/>
+        </w:rPr>
+        <w:t xml:space="preserve">Quem aguenta a streak mais tempo</w:t>
+      </w:r>
+    </w:p>
+    <w:p>
+      <w:pPr>
+        <w:spacing w:after="100"/>
+        <w:ind w:left="240"/>
+      </w:pPr>
+      <w:r>
+        <w:rPr>
+          <w:rFonts w:ascii="Arial" w:cs="Arial" w:eastAsia="Arial" w:hAnsi="Arial"/>
+          <w:color w:val="16A34A"/>
+          <w:sz w:val="26"/>
+          <w:szCs w:val="26"/>
+        </w:rPr>
+        <w:t xml:space="preserve">☐  </w:t>
+      </w:r>
+      <w:r>
+        <w:rPr>
+          <w:rFonts w:ascii="Arial" w:cs="Arial" w:eastAsia="Arial" w:hAnsi="Arial"/>
+          <w:color w:val="1A2E24"/>
+          <w:sz w:val="21"/>
+          <w:szCs w:val="21"/>
+        </w:rPr>
+        <w:t xml:space="preserve">Quem completa primeiro um programa</w:t>
+      </w:r>
+    </w:p>
+    <w:p>
+      <w:pPr>
+        <w:spacing w:after="100"/>
+        <w:ind w:left="240"/>
+      </w:pPr>
+      <w:r>
+        <w:rPr>
+          <w:rFonts w:ascii="Arial" w:cs="Arial" w:eastAsia="Arial" w:hAnsi="Arial"/>
+          <w:color w:val="16A34A"/>
+          <w:sz w:val="26"/>
+          <w:szCs w:val="26"/>
+        </w:rPr>
+        <w:t xml:space="preserve">☐  </w:t>
+      </w:r>
+      <w:r>
+        <w:rPr>
+          <w:rFonts w:ascii="Arial" w:cs="Arial" w:eastAsia="Arial" w:hAnsi="Arial"/>
+          <w:color w:val="1A2E24"/>
+          <w:sz w:val="21"/>
+          <w:szCs w:val="21"/>
+        </w:rPr>
+        <w:t xml:space="preserve">"Bate o meu recorde" — mando o desafio, ele tenta bater</w:t>
+      </w:r>
+    </w:p>
+    <w:p>
+      <w:pPr>
+        <w:spacing w:after="100"/>
+        <w:ind w:left="240"/>
+      </w:pPr>
+      <w:r>
+        <w:rPr>
+          <w:rFonts w:ascii="Arial" w:cs="Arial" w:eastAsia="Arial" w:hAnsi="Arial"/>
+          <w:color w:val="16A34A"/>
+          <w:sz w:val="26"/>
+          <w:szCs w:val="26"/>
+        </w:rPr>
+        <w:t xml:space="preserve">☐  </w:t>
+      </w:r>
+      <w:r>
+        <w:rPr>
+          <w:rFonts w:ascii="Arial" w:cs="Arial" w:eastAsia="Arial" w:hAnsi="Arial"/>
+          <w:color w:val="1A2E24"/>
+          <w:sz w:val="21"/>
+          <w:szCs w:val="21"/>
+        </w:rPr>
+        <w:t xml:space="preserve">Outro: ______________________________</w:t>
+      </w:r>
+    </w:p>
+    <w:p>
+      <w:pPr>
+        <w:spacing w:after="100" w:before="160"/>
+      </w:pPr>
+      <w:r>
+        <w:rPr>
+          <w:rFonts w:ascii="Arial" w:cs="Arial" w:eastAsia="Arial" w:hAnsi="Arial"/>
+          <w:b/>
+          <w:bCs/>
+          <w:color w:val="16A34A"/>
+          <w:sz w:val="22"/>
+          <w:szCs w:val="22"/>
+        </w:rPr>
+        <w:t xml:space="preserve">SOBRE OS TEUS AMIGOS (ajuda-nos a construir bem)</w:t>
+      </w:r>
+    </w:p>
+    <w:p>
+      <w:pPr>
+        <w:spacing w:after="140"/>
+        <w:ind w:left="240"/>
+      </w:pPr>
+      <w:r>
+        <w:rPr>
+          <w:rFonts w:ascii="Arial" w:cs="Arial" w:eastAsia="Arial" w:hAnsi="Arial"/>
+          <w:color w:val="1A2E24"/>
+          <w:sz w:val="21"/>
+          <w:szCs w:val="21"/>
+        </w:rPr>
+        <w:t xml:space="preserve">Quantos amigos teus iam usar isto?  </w:t>
+      </w:r>
+      <w:r>
+        <w:rPr>
+          <w:rFonts w:ascii="Arial" w:cs="Arial" w:eastAsia="Arial" w:hAnsi="Arial"/>
+          <w:color w:val="5B7268"/>
+          <w:sz w:val="21"/>
+          <w:szCs w:val="21"/>
+        </w:rPr>
+        <w:t xml:space="preserve">_______________________________________________</w:t>
+      </w:r>
+    </w:p>
+    <w:p>
+      <w:pPr>
+        <w:spacing w:after="100"/>
+        <w:ind w:left="240"/>
+      </w:pPr>
+      <w:r>
+        <w:rPr>
+          <w:rFonts w:ascii="Arial" w:cs="Arial" w:eastAsia="Arial" w:hAnsi="Arial"/>
+          <w:color w:val="16A34A"/>
+          <w:sz w:val="26"/>
+          <w:szCs w:val="26"/>
+        </w:rPr>
+        <w:t xml:space="preserve">☐  </w:t>
+      </w:r>
+      <w:r>
+        <w:rPr>
+          <w:rFonts w:ascii="Arial" w:cs="Arial" w:eastAsia="Arial" w:hAnsi="Arial"/>
+          <w:color w:val="1A2E24"/>
+          <w:sz w:val="21"/>
+          <w:szCs w:val="21"/>
+        </w:rPr>
+        <w:t xml:space="preserve">Têm telemóvel próprio?   ☐ Sim, a maioria   ☐ Alguns   ☐ Poucos</w:t>
+      </w:r>
+    </w:p>
+    <w:p>
+      <w:pPr>
+        <w:spacing w:after="140"/>
+        <w:ind w:left="240"/>
+      </w:pPr>
+      <w:r>
+        <w:rPr>
+          <w:rFonts w:ascii="Arial" w:cs="Arial" w:eastAsia="Arial" w:hAnsi="Arial"/>
+          <w:color w:val="1A2E24"/>
+          <w:sz w:val="21"/>
+          <w:szCs w:val="21"/>
+        </w:rPr>
+        <w:t xml:space="preserve">Que apps usam para falar?  </w:t>
+      </w:r>
+      <w:r>
+        <w:rPr>
+          <w:rFonts w:ascii="Arial" w:cs="Arial" w:eastAsia="Arial" w:hAnsi="Arial"/>
+          <w:color w:val="5B7268"/>
+          <w:sz w:val="21"/>
+          <w:szCs w:val="21"/>
+        </w:rPr>
+        <w:t xml:space="preserve">_______________________________________________</w:t>
+      </w:r>
+    </w:p>
+    <w:p>
+      <w:pPr>
+        <w:spacing w:after="140" w:before="340"/>
+      </w:pPr>
+      <w:r>
+        <w:rPr>
+          <w:rFonts w:ascii="Arial" w:cs="Arial" w:eastAsia="Arial" w:hAnsi="Arial"/>
+          <w:b/>
+          <w:bCs/>
+          <w:color w:val="F97316"/>
+          <w:sz w:val="26"/>
+          <w:szCs w:val="26"/>
+        </w:rPr>
         <w:t xml:space="preserve">VOTAÇÃO  </w:t>
       </w:r>
       <w:r>

</xml_diff>